<commit_message>
Add online certificate program
</commit_message>
<xml_diff>
--- a/guides/CodeLab_Faculty_and_Admin_Quick_Guide.docx
+++ b/guides/CodeLab_Faculty_and_Admin_Quick_Guide.docx
@@ -482,6 +482,76 @@
       </w:pPr>
       <w:r>
         <w:t xml:space="preserve">Download the temporary passwords as a CSV and share them privately. Students choose their own password at first sign-in.</w:t>
+      </w:r>
+    </w:p>
+    <w:p>
+      <w:pPr>
+        <w:pStyle w:val="ListParagraph"/>
+        <w:numPr>
+          <w:ilvl w:val="0"/>
+          <w:numId w:val="2"/>
+        </w:numPr>
+        <w:spacing w:after="70"/>
+      </w:pPr>
+      <w:r>
+        <w:rPr>
+          <w:b/>
+          <w:bCs/>
+        </w:rPr>
+        <w:t xml:space="preserve">Or let students sign up themselves:</w:t>
+      </w:r>
+      <w:r>
+        <w:t xml:space="preserve"> under </w:t>
+      </w:r>
+      <w:r>
+        <w:rPr>
+          <w:b/>
+          <w:bCs/>
+        </w:rPr>
+        <w:t xml:space="preserve">Class codes</w:t>
+      </w:r>
+      <w:r>
+        <w:t xml:space="preserve">, choose a section, how long the code works and an optional maximum, then </w:t>
+      </w:r>
+      <w:r>
+        <w:rPr>
+          <w:b/>
+          <w:bCs/>
+        </w:rPr>
+        <w:t xml:space="preserve">Create class code</w:t>
+      </w:r>
+      <w:r>
+        <w:t xml:space="preserve">. Share the code, the link (</w:t>
+      </w:r>
+      <w:r>
+        <w:rPr>
+          <w:b/>
+          <w:bCs/>
+        </w:rPr>
+        <w:t xml:space="preserve">Copy link</w:t>
+      </w:r>
+      <w:r>
+        <w:t xml:space="preserve">) or a printed sheet (</w:t>
+      </w:r>
+      <w:r>
+        <w:rPr>
+          <w:b/>
+          <w:bCs/>
+        </w:rPr>
+        <w:t xml:space="preserve">Print</w:t>
+      </w:r>
+      <w:r>
+        <w:t xml:space="preserve">). Students use </w:t>
+      </w:r>
+      <w:r>
+        <w:rPr>
+          <w:b/>
+          <w:bCs/>
+        </w:rPr>
+        <w:t xml:space="preserve">Join a class</w:t>
+      </w:r>
+      <w:r>
+        <w:t xml:space="preserve"> on the front page and land in that section. Turn the code off when the class has joined.</w:t>
       </w:r>
     </w:p>
     <w:p>
@@ -1438,6 +1508,30 @@
     </w:lvl>
   </w:abstractNum>
   <w:abstractNum w:abstractNumId="9" w15:restartNumberingAfterBreak="0">
+    <w:multiLevelType w:val="hybridMultilevel"/>
+    <w:lvl w:ilvl="0" w:tentative="1">
+      <w:start w:val="1"/>
+      <w:numFmt w:val="decimal"/>
+      <w:lvlText w:val="%1."/>
+      <w:lvlJc w:val="left"/>
+      <w:pPr>
+        <w:ind w:left="500" w:hanging="300"/>
+      </w:pPr>
+    </w:lvl>
+  </w:abstractNum>
+  <w:abstractNum w:abstractNumId="10" w15:restartNumberingAfterBreak="0">
+    <w:multiLevelType w:val="hybridMultilevel"/>
+    <w:lvl w:ilvl="0" w:tentative="1">
+      <w:start w:val="1"/>
+      <w:numFmt w:val="decimal"/>
+      <w:lvlText w:val="%1."/>
+      <w:lvlJc w:val="left"/>
+      <w:pPr>
+        <w:ind w:left="500" w:hanging="300"/>
+      </w:pPr>
+    </w:lvl>
+  </w:abstractNum>
+  <w:abstractNum w:abstractNumId="11" w15:restartNumberingAfterBreak="0">
     <w:multiLevelType w:val="hybridMultilevel"/>
     <w:lvl w:ilvl="0" w:tentative="1">
       <w:start w:val="1"/>

</xml_diff>